<commit_message>
Documenta justificación de Chatwoot y nota de costo en sección 9.1
Agrega al final de la sección 9.1 (Handoff bot-humano por negocio) por
qué se eligió Chatwoot sobre otras alternativas (múltiples bandejas con
permisos independientes por negocio, sin escenario de Make.com separado
por cliente) y una nota de costo: el plan gratuito Hacker no incluye
bandejas de WhatsApp ni API, se requiere plan de pago (mínimo Startups,
~$19 USD/agente/mes); decisión de dejar el bot pausado hasta tener una
campaña publicitaria lista. No se modificó ninguna otra sección.

Co-Authored-By: Claude Sonnet 5 <noreply@anthropic.com>
</commit_message>
<xml_diff>
--- a/analisis_competencia_tecolutla.docx
+++ b/analisis_competencia_tecolutla.docx
@@ -5256,6 +5256,26 @@
       </w:r>
       <w:r>
         <w:t>o "Collaborator" de su propia bandeja — Chatwoot bloquea automáticamente que vea conversaciones de otros negocios (Xanat, otros clientes del bot). Escalar a un hotel nuevo significa agregar una bandeja más a la cuenta existente, no rehacer infraestructura.</w:t>
+      </w:r>
+    </w:p>
+    <w:p>
+      <w:pPr>
+        <w:spacing w:after="120"/>
+      </w:pPr>
+      <w:r>
+        <w:t>Chatwoot se eligió sobre otras alternativas porque permite tener múltiples bandejas dentro de una sola cuenta, cada una con permisos independientes — cada dueño de negocio (Casa Xanath, Casa Azura, y futuros hoteleros que compren el bot como producto de pago) puede tener su propio usuario y contraseña, viendo solo sus propias conversaciones, sin necesitar un escenario de Make.com distinto por cada cliente. Esto encaja con el plan de vender esta misma arquitectura de bot a hoteleros de Tecolutla como servicio aparte del directorio.</w:t>
+      </w:r>
+    </w:p>
+    <w:p>
+      <w:pPr>
+        <w:spacing w:after="120"/>
+      </w:pPr>
+      <w:r>
+        <w:rPr>
+          <w:i/>
+          <w:iCs/>
+        </w:rPr>
+        <w:t>Nota de costo: Chatwoot Cloud en el plan Hacker (gratuito) NO incluye bandejas de WhatsApp ni acceso a API — solo chat en vivo de sitio web. Para que el bot de WhatsApp funcione en producción se requiere un plan de pago (mínimo "Startups", ~$19 USD/agente/mes). Decisión: dejar el bot pausado sin pagar hasta que haya una campaña publicitaria lista para ponerlo en marcha de verdad.</w:t>
       </w:r>
     </w:p>
     <w:p>

</xml_diff>

<commit_message>
Agrega el agente revisor-sitemap y su documentación
Nuevo subagente en .claude/agents/revisor-sitemap.md: compila el sitio y
compara el sitemap.xml generado contra los enlaces internos reales y las
etiquetas canónicas — cierra el requisito de la sección 10.2 del plan de
negocio que revisor-tecnico deja fuera a propósito (de solo lectura, no
puede compilar el sitio). Requiere Bash, por eso es un agente separado.

Se agrega Agentes_del_proyecto.docx documentando ambos agentes (qué
hacen, cuándo usarlos) para referencia no técnica.

También se sube analisis_competencia_tecolutla.docx con la actualización
de la sección 12.6 de una sesión anterior (disponibilidad por WhatsApp
pasa a pendiente técnico; autoedición de fotos/video/precio como nuevo
pendiente de V2), que había quedado guardada en disco sin comitear.

Co-Authored-By: Claude Sonnet 5 <noreply@anthropic.com>
</commit_message>
<xml_diff>
--- a/analisis_competencia_tecolutla.docx
+++ b/analisis_competencia_tecolutla.docx
@@ -7860,6 +7860,36 @@
         </w:tc>
       </w:tr>
     </w:tbl>
+    <w:p>
+      <w:pPr>
+        <w:spacing w:after="120"/>
+      </w:pPr>
+      <w:r>
+        <w:rPr>
+          <w:b/>
+          <w:bCs/>
+        </w:rPr>
+        <w:t xml:space="preserve">Actualización (2026-08-02) — disponibilidad por WhatsApp: </w:t>
+      </w:r>
+      <w:r>
+        <w:t xml:space="preserve">se trata igual que el precio — pendiente técnico. Se construye toda la infraestructura necesaria (webhook de actualización y escenario de Make.com que lo conecte a un mensaje de WhatsApp del negocio), pero no se activa ni se expone en el sitio por el momento. Se reevalúa junto con el precio al hacer la valuación final del proyecto.</w:t>
+      </w:r>
+    </w:p>
+    <w:p>
+      <w:pPr>
+        <w:spacing w:after="120"/>
+      </w:pPr>
+      <w:r>
+        <w:rPr>
+          <w:b/>
+          <w:bCs/>
+        </w:rPr>
+        <w:t xml:space="preserve">Actualización (2026-08-02) — autoedición de fotos y video: </w:t>
+      </w:r>
+      <w:r>
+        <w:t xml:space="preserve">se agrega como pendiente nuevo de V2, exclusivo del plan de pago. El negocio debe poder cambiar su propio precio y subir sus propias fotos y video sin depender de que el staff lo haga por él desde /panel-anuncios (que hoy es la única vía y requiere intervención manual). Construir el mecanismo de autoservicio (vía WhatsApp o enlace personal) queda pendiente.</w:t>
+      </w:r>
+    </w:p>
     <w:p>
       <w:pPr>
         <w:pStyle w:val="Ttulo2"/>

</xml_diff>

<commit_message>
Documenta la especificación del logo en la ficha (sección 8.4)
Agrega la sección 8.4 al documento maestro con las medidas exactas
ya afinadas y probadas con Casa Xanath (tamaño, forma, posición,
separación horizontal y alineación vertical), para replicarlas tal
cual cuando el resto de los negocios entregue su logotipo.

Co-Authored-By: Claude Sonnet 5 <noreply@anthropic.com>
</commit_message>
<xml_diff>
--- a/analisis_competencia_tecolutla.docx
+++ b/analisis_competencia_tecolutla.docx
@@ -5257,6 +5257,352 @@
           <w:iCs/>
         </w:rPr>
         <w:t>Estas reglas se muestran explícitamente al negocio desde el momento del alta, no como sorpresa posterior, para que el compromiso sea informado desde el inicio.</w:t>
+      </w:r>
+    </w:p>
+    <w:p>
+      <w:pPr>
+        <w:pStyle w:val="Ttulo2"/>
+        <w:spacing w:before="250" w:after="120"/>
+      </w:pPr>
+      <w:r>
+        <w:t>8.4 Logotipo del negocio en la cabecera de la ficha</w:t>
+      </w:r>
+    </w:p>
+    <w:p>
+      <w:pPr>
+        <w:spacing w:after="120"/>
+      </w:pPr>
+      <w:r>
+        <w:t xml:space="preserve">Campo opcional (`logo`, imagen) agregado en agosto de 2026: si el negocio proporciona su logotipo real, se muestra junto a su nombre en la franja de color de la cabecera de su ficha. Es una mejora visual, no un requisito — la mayoría de los negocios hoy no tiene logo cargado y su ficha se ve exactamente igual que antes. La tabla siguiente documenta las medidas exactas ya afinadas y probadas con Casa Xanath, como piloto, para aplicar la misma proporción cuando el resto de los negocios entregue su logotipo.</w:t>
+      </w:r>
+    </w:p>
+    <w:tbl>
+      <w:tblPr>
+        <w:tblW w:w="9200" w:type="dxa"/>
+        <w:tblBorders>
+          <w:top w:val="single" w:sz="4" w:space="0" w:color="auto"/>
+          <w:left w:val="single" w:sz="4" w:space="0" w:color="auto"/>
+          <w:bottom w:val="single" w:sz="4" w:space="0" w:color="auto"/>
+          <w:right w:val="single" w:sz="4" w:space="0" w:color="auto"/>
+          <w:insideH w:val="single" w:sz="4" w:space="0" w:color="auto"/>
+          <w:insideV w:val="single" w:sz="4" w:space="0" w:color="auto"/>
+        </w:tblBorders>
+        <w:tblCellMar>
+          <w:left w:w="10" w:type="dxa"/>
+          <w:right w:w="10" w:type="dxa"/>
+        </w:tblCellMar>
+        <w:tblLook w:val="04A0" w:firstRow="1" w:lastRow="0" w:firstColumn="1" w:lastColumn="0" w:noHBand="0" w:noVBand="1"/>
+      </w:tblPr>
+      <w:tblGrid>
+        <w:gridCol w:w="3000"/>
+        <w:gridCol w:w="6200"/>
+      </w:tblGrid>
+      <w:tr>
+        <w:tblPrEx>
+          <w:tblCellMar>
+            <w:top w:w="0" w:type="dxa"/>
+            <w:bottom w:w="0" w:type="dxa"/>
+          </w:tblCellMar>
+        </w:tblPrEx>
+        <w:trPr>
+          <w:tblHeader/>
+        </w:trPr>
+        <w:tc>
+          <w:tcPr>
+            <w:tcW w:w="3000" w:type="dxa"/>
+            <w:shd w:val="clear" w:color="auto" w:fill="2F5496"/>
+            <w:tcMar>
+              <w:top w:w="80" w:type="dxa"/>
+              <w:left w:w="100" w:type="dxa"/>
+              <w:bottom w:w="80" w:type="dxa"/>
+              <w:right w:w="100" w:type="dxa"/>
+            </w:tcMar>
+          </w:tcPr>
+          <w:p>
+            <w:r>
+              <w:rPr>
+                <w:b/>
+                <w:bCs/>
+                <w:color w:val="FFFFFF"/>
+              </w:rPr>
+              <w:t xml:space="preserve">Campo</w:t>
+            </w:r>
+          </w:p>
+        </w:tc>
+        <w:tc>
+          <w:tcPr>
+            <w:tcW w:w="6200" w:type="dxa"/>
+            <w:shd w:val="clear" w:color="auto" w:fill="2F5496"/>
+            <w:tcMar>
+              <w:top w:w="80" w:type="dxa"/>
+              <w:left w:w="100" w:type="dxa"/>
+              <w:bottom w:w="80" w:type="dxa"/>
+              <w:right w:w="100" w:type="dxa"/>
+            </w:tcMar>
+          </w:tcPr>
+          <w:p>
+            <w:r>
+              <w:rPr>
+                <w:b/>
+                <w:bCs/>
+                <w:color w:val="FFFFFF"/>
+              </w:rPr>
+              <w:t xml:space="preserve">Valor</w:t>
+            </w:r>
+          </w:p>
+        </w:tc>
+      </w:tr>
+      <w:tr>
+        <w:tblPrEx>
+          <w:tblCellMar>
+            <w:top w:w="0" w:type="dxa"/>
+            <w:bottom w:w="0" w:type="dxa"/>
+          </w:tblCellMar>
+        </w:tblPrEx>
+        <w:tc>
+          <w:tcPr>
+            <w:tcW w:w="3000" w:type="dxa"/>
+            <w:tcMar>
+              <w:top w:w="80" w:type="dxa"/>
+              <w:left w:w="100" w:type="dxa"/>
+              <w:bottom w:w="80" w:type="dxa"/>
+              <w:right w:w="100" w:type="dxa"/>
+            </w:tcMar>
+          </w:tcPr>
+          <w:p>
+            <w:r>
+              <w:t xml:space="preserve">Tamaño</w:t>
+            </w:r>
+          </w:p>
+        </w:tc>
+        <w:tc>
+          <w:tcPr>
+            <w:tcW w:w="6200" w:type="dxa"/>
+            <w:tcMar>
+              <w:top w:w="80" w:type="dxa"/>
+              <w:left w:w="100" w:type="dxa"/>
+              <w:bottom w:w="80" w:type="dxa"/>
+              <w:right w:w="100" w:type="dxa"/>
+            </w:tcMar>
+          </w:tcPr>
+          <w:p>
+            <w:r>
+              <w:t xml:space="preserve">96 px (6rem) — el mismo tamaño en escritorio y celular</w:t>
+            </w:r>
+          </w:p>
+        </w:tc>
+      </w:tr>
+      <w:tr>
+        <w:tblPrEx>
+          <w:tblCellMar>
+            <w:top w:w="0" w:type="dxa"/>
+            <w:bottom w:w="0" w:type="dxa"/>
+          </w:tblCellMar>
+        </w:tblPrEx>
+        <w:tc>
+          <w:tcPr>
+            <w:tcW w:w="3000" w:type="dxa"/>
+            <w:tcMar>
+              <w:top w:w="80" w:type="dxa"/>
+              <w:left w:w="100" w:type="dxa"/>
+              <w:bottom w:w="80" w:type="dxa"/>
+              <w:right w:w="100" w:type="dxa"/>
+            </w:tcMar>
+          </w:tcPr>
+          <w:p>
+            <w:r>
+              <w:t xml:space="preserve">Forma</w:t>
+            </w:r>
+          </w:p>
+        </w:tc>
+        <w:tc>
+          <w:tcPr>
+            <w:tcW w:w="6200" w:type="dxa"/>
+            <w:tcMar>
+              <w:top w:w="80" w:type="dxa"/>
+              <w:left w:w="100" w:type="dxa"/>
+              <w:bottom w:w="80" w:type="dxa"/>
+              <w:right w:w="100" w:type="dxa"/>
+            </w:tcMar>
+          </w:tcPr>
+          <w:p>
+            <w:r>
+              <w:t xml:space="preserve">Circular, con borde blanco de 3px y sombra suave</w:t>
+            </w:r>
+          </w:p>
+        </w:tc>
+      </w:tr>
+      <w:tr>
+        <w:tblPrEx>
+          <w:tblCellMar>
+            <w:top w:w="0" w:type="dxa"/>
+            <w:bottom w:w="0" w:type="dxa"/>
+          </w:tblCellMar>
+        </w:tblPrEx>
+        <w:tc>
+          <w:tcPr>
+            <w:tcW w:w="3000" w:type="dxa"/>
+            <w:tcMar>
+              <w:top w:w="80" w:type="dxa"/>
+              <w:left w:w="100" w:type="dxa"/>
+              <w:bottom w:w="80" w:type="dxa"/>
+              <w:right w:w="100" w:type="dxa"/>
+            </w:tcMar>
+          </w:tcPr>
+          <w:p>
+            <w:r>
+              <w:t xml:space="preserve">Posición</w:t>
+            </w:r>
+          </w:p>
+        </w:tc>
+        <w:tc>
+          <w:tcPr>
+            <w:tcW w:w="6200" w:type="dxa"/>
+            <w:tcMar>
+              <w:top w:w="80" w:type="dxa"/>
+              <w:left w:w="100" w:type="dxa"/>
+              <w:bottom w:w="80" w:type="dxa"/>
+              <w:right w:w="100" w:type="dxa"/>
+            </w:tcMar>
+          </w:tcPr>
+          <w:p>
+            <w:r>
+              <w:t xml:space="preserve">Esquina superior derecha del nombre del negocio, dentro de la franja de color de la cabecera</w:t>
+            </w:r>
+          </w:p>
+        </w:tc>
+      </w:tr>
+      <w:tr>
+        <w:tblPrEx>
+          <w:tblCellMar>
+            <w:top w:w="0" w:type="dxa"/>
+            <w:bottom w:w="0" w:type="dxa"/>
+          </w:tblCellMar>
+        </w:tblPrEx>
+        <w:tc>
+          <w:tcPr>
+            <w:tcW w:w="3000" w:type="dxa"/>
+            <w:tcMar>
+              <w:top w:w="80" w:type="dxa"/>
+              <w:left w:w="100" w:type="dxa"/>
+              <w:bottom w:w="80" w:type="dxa"/>
+              <w:right w:w="100" w:type="dxa"/>
+            </w:tcMar>
+          </w:tcPr>
+          <w:p>
+            <w:r>
+              <w:t xml:space="preserve">Separación horizontal</w:t>
+            </w:r>
+          </w:p>
+        </w:tc>
+        <w:tc>
+          <w:tcPr>
+            <w:tcW w:w="6200" w:type="dxa"/>
+            <w:tcMar>
+              <w:top w:w="80" w:type="dxa"/>
+              <w:left w:w="100" w:type="dxa"/>
+              <w:bottom w:w="80" w:type="dxa"/>
+              <w:right w:w="100" w:type="dxa"/>
+            </w:tcMar>
+          </w:tcPr>
+          <w:p>
+            <w:r>
+              <w:t xml:space="preserve">3 mm respecto al final del texto del nombre</w:t>
+            </w:r>
+          </w:p>
+        </w:tc>
+      </w:tr>
+      <w:tr>
+        <w:tblPrEx>
+          <w:tblCellMar>
+            <w:top w:w="0" w:type="dxa"/>
+            <w:bottom w:w="0" w:type="dxa"/>
+          </w:tblCellMar>
+        </w:tblPrEx>
+        <w:tc>
+          <w:tcPr>
+            <w:tcW w:w="3000" w:type="dxa"/>
+            <w:tcMar>
+              <w:top w:w="80" w:type="dxa"/>
+              <w:left w:w="100" w:type="dxa"/>
+              <w:bottom w:w="80" w:type="dxa"/>
+              <w:right w:w="100" w:type="dxa"/>
+            </w:tcMar>
+          </w:tcPr>
+          <w:p>
+            <w:r>
+              <w:t xml:space="preserve">Alineación vertical</w:t>
+            </w:r>
+          </w:p>
+        </w:tc>
+        <w:tc>
+          <w:tcPr>
+            <w:tcW w:w="6200" w:type="dxa"/>
+            <w:tcMar>
+              <w:top w:w="80" w:type="dxa"/>
+              <w:left w:w="100" w:type="dxa"/>
+              <w:bottom w:w="80" w:type="dxa"/>
+              <w:right w:w="100" w:type="dxa"/>
+            </w:tcMar>
+          </w:tcPr>
+          <w:p>
+            <w:r>
+              <w:t xml:space="preserve">El borde inferior del logo se alinea con la base de las letras del nombre — no se monta sobre las etiquetas "Destacado"/"Verificado" ni sobre el enlace "Volver a…"</w:t>
+            </w:r>
+          </w:p>
+        </w:tc>
+      </w:tr>
+      <w:tr>
+        <w:tblPrEx>
+          <w:tblCellMar>
+            <w:top w:w="0" w:type="dxa"/>
+            <w:bottom w:w="0" w:type="dxa"/>
+          </w:tblCellMar>
+        </w:tblPrEx>
+        <w:tc>
+          <w:tcPr>
+            <w:tcW w:w="3000" w:type="dxa"/>
+            <w:tcMar>
+              <w:top w:w="80" w:type="dxa"/>
+              <w:left w:w="100" w:type="dxa"/>
+              <w:bottom w:w="80" w:type="dxa"/>
+              <w:right w:w="100" w:type="dxa"/>
+            </w:tcMar>
+          </w:tcPr>
+          <w:p>
+            <w:r>
+              <w:t xml:space="preserve">Si el negocio no tiene logo</w:t>
+            </w:r>
+          </w:p>
+        </w:tc>
+        <w:tc>
+          <w:tcPr>
+            <w:tcW w:w="6200" w:type="dxa"/>
+            <w:tcMar>
+              <w:top w:w="80" w:type="dxa"/>
+              <w:left w:w="100" w:type="dxa"/>
+              <w:bottom w:w="80" w:type="dxa"/>
+              <w:right w:w="100" w:type="dxa"/>
+            </w:tcMar>
+          </w:tcPr>
+          <w:p>
+            <w:r>
+              <w:t xml:space="preserve">Se muestra el ícono genérico de la categoría — nunca se inventa ni se sustituye un logo</w:t>
+            </w:r>
+          </w:p>
+        </w:tc>
+      </w:tr>
+    </w:tbl>
+    <w:p>
+      <w:pPr>
+        <w:spacing w:after="120"/>
+      </w:pPr>
+      <w:r>
+        <w:rPr>
+          <w:i/>
+          <w:iCs/>
+        </w:rPr>
+        <w:t>Nota (2026-08-05): implementado y probado primero en Casa Xanath. Al recibir el logotipo de un negocio nuevo, se coloca con exactamente estas mismas medidas — no se rediseña caso por caso.</w:t>
       </w:r>
     </w:p>
     <w:p>

</xml_diff>